<commit_message>
Actualizar informe: Fuente 3 (INE poblacion) con datos reales + tabla resumen de fuentes verificadas
Tabla Fuente 3 (Censo INE / Plataforma de Datos) actualizada con el hallazgo real:
Feature Service publico de Observatorio de Ciudades UC (Censo 2017), 10.750
manzanas y 1.005.013 habitantes en el Gran Valparaiso.

Se agrega ademas al Resumen ejecutivo una tabla comparativa con las 6 fuentes
(Metadata #1-3, Amenaza #1-3), su resultado verificado y estado OK.
</commit_message>
<xml_diff>
--- a/Informe-Ruteo-Resiliente-Drones.docx
+++ b/Informe-Ruteo-Resiliente-Drones.docx
@@ -663,6 +663,397 @@
       </w:r>
     </w:p>
     <w:p>
+      <w:r>
+        <w:t>Resumen de verificación de fuentes (Tarea 1): las 6 fuentes de datos del proyecto ya fueron probadas con datos reales (no solo argumentadas), ver detalle en las secciones 5, 6 y en codigo/RESULTADOS.md:</w:t>
+      </w:r>
+    </w:p>
+    <w:tbl>
+      <w:tblPr>
+        <w:tblStyle w:val="Table6"/>
+        <w:tblW w:w="9026.0" w:type="dxa"/>
+        <w:jc w:val="left"/>
+        <w:tblBorders>
+          <w:top w:color="000000" w:space="0" w:sz="4" w:val="single"/>
+          <w:left w:color="000000" w:space="0" w:sz="4" w:val="single"/>
+          <w:bottom w:color="000000" w:space="0" w:sz="4" w:val="single"/>
+          <w:right w:color="000000" w:space="0" w:sz="4" w:val="single"/>
+          <w:insideH w:color="000000" w:space="0" w:sz="4" w:val="single"/>
+          <w:insideV w:color="000000" w:space="0" w:sz="4" w:val="single"/>
+        </w:tblBorders>
+        <w:tblLayout w:type="fixed"/>
+        <w:tblLook w:val="0000"/>
+      </w:tblPr>
+      <w:tblGrid>
+        <w:gridCol w:w="1289"/>
+        <w:gridCol w:w="1289"/>
+        <w:gridCol w:w="1289"/>
+        <w:gridCol w:w="1289"/>
+        <w:gridCol w:w="1289"/>
+        <w:gridCol w:w="1289"/>
+        <w:gridCol w:w="1289"/>
+      </w:tblGrid>
+      <w:tr>
+        <w:tc>
+          <w:tcPr>
+            <w:tcW w:type="dxa" w:w="1289"/>
+          </w:tcPr>
+          <w:p>
+            <w:r>
+              <w:t>Temática</w:t>
+            </w:r>
+          </w:p>
+        </w:tc>
+        <w:tc>
+          <w:tcPr>
+            <w:tcW w:type="dxa" w:w="1289"/>
+          </w:tcPr>
+          <w:p>
+            <w:r>
+              <w:t>Metadata #1</w:t>
+            </w:r>
+          </w:p>
+        </w:tc>
+        <w:tc>
+          <w:tcPr>
+            <w:tcW w:type="dxa" w:w="1289"/>
+          </w:tcPr>
+          <w:p>
+            <w:r>
+              <w:t>Metadata #2</w:t>
+            </w:r>
+          </w:p>
+        </w:tc>
+        <w:tc>
+          <w:tcPr>
+            <w:tcW w:type="dxa" w:w="1289"/>
+          </w:tcPr>
+          <w:p>
+            <w:r>
+              <w:t>Metadata #3</w:t>
+            </w:r>
+          </w:p>
+        </w:tc>
+        <w:tc>
+          <w:tcPr>
+            <w:tcW w:type="dxa" w:w="1289"/>
+          </w:tcPr>
+          <w:p>
+            <w:r>
+              <w:t>Amenaza #1</w:t>
+            </w:r>
+          </w:p>
+        </w:tc>
+        <w:tc>
+          <w:tcPr>
+            <w:tcW w:type="dxa" w:w="1289"/>
+          </w:tcPr>
+          <w:p>
+            <w:r>
+              <w:t>Amenaza #2</w:t>
+            </w:r>
+          </w:p>
+        </w:tc>
+        <w:tc>
+          <w:tcPr>
+            <w:tcW w:type="dxa" w:w="1289"/>
+          </w:tcPr>
+          <w:p>
+            <w:r>
+              <w:t>Amenaza #3</w:t>
+            </w:r>
+          </w:p>
+        </w:tc>
+      </w:tr>
+      <w:tr>
+        <w:tc>
+          <w:tcPr>
+            <w:tcW w:type="dxa" w:w="1289"/>
+          </w:tcPr>
+          <w:p>
+            <w:r>
+              <w:t>Fuente</w:t>
+            </w:r>
+          </w:p>
+        </w:tc>
+        <w:tc>
+          <w:tcPr>
+            <w:tcW w:type="dxa" w:w="1289"/>
+          </w:tcPr>
+          <w:p>
+            <w:r>
+              <w:t>Open-Meteo</w:t>
+            </w:r>
+          </w:p>
+        </w:tc>
+        <w:tc>
+          <w:tcPr>
+            <w:tcW w:type="dxa" w:w="1289"/>
+          </w:tcPr>
+          <w:p>
+            <w:r>
+              <w:t>OSM local (Geofabrik)</w:t>
+            </w:r>
+          </w:p>
+        </w:tc>
+        <w:tc>
+          <w:tcPr>
+            <w:tcW w:type="dxa" w:w="1289"/>
+          </w:tcPr>
+          <w:p>
+            <w:r>
+              <w:t>INE (Censo 2017, vía Observatorio de Ciudades UC)</w:t>
+            </w:r>
+          </w:p>
+        </w:tc>
+        <w:tc>
+          <w:tcPr>
+            <w:tcW w:type="dxa" w:w="1289"/>
+          </w:tcPr>
+          <w:p>
+            <w:r>
+              <w:t>NASA FIRMS</w:t>
+            </w:r>
+          </w:p>
+        </w:tc>
+        <w:tc>
+          <w:tcPr>
+            <w:tcW w:type="dxa" w:w="1289"/>
+          </w:tcPr>
+          <w:p>
+            <w:r>
+              <w:t>CONAF</w:t>
+            </w:r>
+          </w:p>
+        </w:tc>
+        <w:tc>
+          <w:tcPr>
+            <w:tcW w:type="dxa" w:w="1289"/>
+          </w:tcPr>
+          <w:p>
+            <w:r>
+              <w:t>USGS / CSN</w:t>
+            </w:r>
+          </w:p>
+        </w:tc>
+      </w:tr>
+      <w:tr>
+        <w:tc>
+          <w:tcPr>
+            <w:tcW w:type="dxa" w:w="1289"/>
+          </w:tcPr>
+          <w:p>
+            <w:r>
+              <w:t>Qué mide</w:t>
+            </w:r>
+          </w:p>
+        </w:tc>
+        <w:tc>
+          <w:tcPr>
+            <w:tcW w:type="dxa" w:w="1289"/>
+          </w:tcPr>
+          <w:p>
+            <w:r>
+              <w:t>Viento y rachas</w:t>
+            </w:r>
+          </w:p>
+        </w:tc>
+        <w:tc>
+          <w:tcPr>
+            <w:tcW w:type="dxa" w:w="1289"/>
+          </w:tcPr>
+          <w:p>
+            <w:r>
+              <w:t>Altura de edificación</w:t>
+            </w:r>
+          </w:p>
+        </w:tc>
+        <w:tc>
+          <w:tcPr>
+            <w:tcW w:type="dxa" w:w="1289"/>
+          </w:tcPr>
+          <w:p>
+            <w:r>
+              <w:t>Población por manzana censal</w:t>
+            </w:r>
+          </w:p>
+        </w:tc>
+        <w:tc>
+          <w:tcPr>
+            <w:tcW w:type="dxa" w:w="1289"/>
+          </w:tcPr>
+          <w:p>
+            <w:r>
+              <w:t>Focos de incendio activo</w:t>
+            </w:r>
+          </w:p>
+        </w:tc>
+        <w:tc>
+          <w:tcPr>
+            <w:tcW w:type="dxa" w:w="1289"/>
+          </w:tcPr>
+          <w:p>
+            <w:r>
+              <w:t>Probabilidad de ignición a 5 días</w:t>
+            </w:r>
+          </w:p>
+        </w:tc>
+        <w:tc>
+          <w:tcPr>
+            <w:tcW w:type="dxa" w:w="1289"/>
+          </w:tcPr>
+          <w:p>
+            <w:r>
+              <w:t>Sismicidad</w:t>
+            </w:r>
+          </w:p>
+        </w:tc>
+      </w:tr>
+      <w:tr>
+        <w:tc>
+          <w:tcPr>
+            <w:tcW w:type="dxa" w:w="1289"/>
+          </w:tcPr>
+          <w:p>
+            <w:r>
+              <w:t>Resultado verificado</w:t>
+            </w:r>
+          </w:p>
+        </w:tc>
+        <w:tc>
+          <w:tcPr>
+            <w:tcW w:type="dxa" w:w="1289"/>
+          </w:tcPr>
+          <w:p>
+            <w:r>
+              <w:t>Rachas reales hasta 45 km/h</w:t>
+            </w:r>
+          </w:p>
+        </w:tc>
+        <w:tc>
+          <w:tcPr>
+            <w:tcW w:type="dxa" w:w="1289"/>
+          </w:tcPr>
+          <w:p>
+            <w:r>
+              <w:t>74.550 edificios, 17.961 con altura (24,1%)</w:t>
+            </w:r>
+          </w:p>
+        </w:tc>
+        <w:tc>
+          <w:tcPr>
+            <w:tcW w:type="dxa" w:w="1289"/>
+          </w:tcPr>
+          <w:p>
+            <w:r>
+              <w:t>10.750 manzanas, 1.005.013 habitantes</w:t>
+            </w:r>
+          </w:p>
+        </w:tc>
+        <w:tc>
+          <w:tcPr>
+            <w:tcW w:type="dxa" w:w="1289"/>
+          </w:tcPr>
+          <w:p>
+            <w:r>
+              <w:t>7 focos reales en Chile (de 56 en el bbox bruto)</w:t>
+            </w:r>
+          </w:p>
+        </w:tc>
+        <w:tc>
+          <w:tcPr>
+            <w:tcW w:type="dxa" w:w="1289"/>
+          </w:tcPr>
+          <w:p>
+            <w:r>
+              <w:t>Polígonos de riesgo + áreas protegidas, pronóstico diario a 5 días</w:t>
+            </w:r>
+          </w:p>
+        </w:tc>
+        <w:tc>
+          <w:tcPr>
+            <w:tcW w:type="dxa" w:w="1289"/>
+          </w:tcPr>
+          <w:p>
+            <w:r>
+              <w:t>105 sismos M≥2 desde 2015</w:t>
+            </w:r>
+          </w:p>
+        </w:tc>
+      </w:tr>
+      <w:tr>
+        <w:tc>
+          <w:tcPr>
+            <w:tcW w:type="dxa" w:w="1289"/>
+          </w:tcPr>
+          <w:p>
+            <w:r>
+              <w:t>Estado</w:t>
+            </w:r>
+          </w:p>
+        </w:tc>
+        <w:tc>
+          <w:tcPr>
+            <w:tcW w:type="dxa" w:w="1289"/>
+          </w:tcPr>
+          <w:p>
+            <w:r>
+              <w:t>OK</w:t>
+            </w:r>
+          </w:p>
+        </w:tc>
+        <w:tc>
+          <w:tcPr>
+            <w:tcW w:type="dxa" w:w="1289"/>
+          </w:tcPr>
+          <w:p>
+            <w:r>
+              <w:t>OK</w:t>
+            </w:r>
+          </w:p>
+        </w:tc>
+        <w:tc>
+          <w:tcPr>
+            <w:tcW w:type="dxa" w:w="1289"/>
+          </w:tcPr>
+          <w:p>
+            <w:r>
+              <w:t>OK</w:t>
+            </w:r>
+          </w:p>
+        </w:tc>
+        <w:tc>
+          <w:tcPr>
+            <w:tcW w:type="dxa" w:w="1289"/>
+          </w:tcPr>
+          <w:p>
+            <w:r>
+              <w:t>OK</w:t>
+            </w:r>
+          </w:p>
+        </w:tc>
+        <w:tc>
+          <w:tcPr>
+            <w:tcW w:type="dxa" w:w="1289"/>
+          </w:tcPr>
+          <w:p>
+            <w:r>
+              <w:t>OK</w:t>
+            </w:r>
+          </w:p>
+        </w:tc>
+        <w:tc>
+          <w:tcPr>
+            <w:tcW w:type="dxa" w:w="1289"/>
+          </w:tcPr>
+          <w:p>
+            <w:r>
+              <w:t>OK</w:t>
+            </w:r>
+          </w:p>
+        </w:tc>
+      </w:tr>
+    </w:tbl>
+    <w:p>
       <w:pPr>
         <w:pStyle w:val="Heading1"/>
         <w:spacing w:after="160" w:before="360" w:lineRule="auto"/>
@@ -5700,7 +6091,7 @@
                 <w:szCs w:val="19"/>
                 <w:rtl w:val="0"/>
               </w:rPr>
-              <w:t xml:space="preserve">Descarga de capas geoespaciales</w:t>
+              <w:t>Feature Service ArcGIS REST público, sin API key (paginado con resultOffset)</w:t>
             </w:r>
             <w:r>
               <w:rPr>
@@ -5768,7 +6159,7 @@
                 <w:szCs w:val="19"/>
                 <w:rtl w:val="0"/>
               </w:rPr>
-              <w:t xml:space="preserve">https://www.ine.gob.cl/  ·  https://www.plataformadedatos.cl/  ·  https://www.ide.cl/</w:t>
+              <w:t>https://services9.arcgis.com/kKJR3Qt68ohAWuet/arcgis/rest/services/Manzanas_censo_2017/FeatureServer  ·  publicado por Observatorio de Ciudades UC con datos del Censo 2017 (el portal genérico ine.gob.cl no expone un endpoint REST abierto usable)</w:t>
             </w:r>
             <w:r>
               <w:rPr>
@@ -5836,7 +6227,7 @@
                 <w:szCs w:val="19"/>
                 <w:rtl w:val="0"/>
               </w:rPr>
-              <w:t xml:space="preserve">Capa cargada en PostGIS más consulta ST_Intersects con el buffer de aristas</w:t>
+              <w:t>10.750 manzanas reales con geometría de polígono y 1.005.013 habitantes obtenidas para las 5 comunas del Gran Valparaíso; mapa de densidad en evidencia/imagenes/mapa_ine_poblacion_manzanas.png</w:t>
             </w:r>
             <w:r>
               <w:rPr>

</xml_diff>